<commit_message>
Add Email Newsletter Functionality
</commit_message>
<xml_diff>
--- a/assets/Report/BlogScript Project Final Report.docx
+++ b/assets/Report/BlogScript Project Final Report.docx
@@ -57,7 +57,7 @@
           <w:b/>
           <w:sz w:val="40"/>
         </w:rPr>
-        <w:t>1</w:t>
+        <w:t>5</w:t>
       </w:r>
       <w:r>
         <w:rPr>
@@ -9192,29 +9192,7 @@
           <w:szCs w:val="24"/>
           <w:lang w:val="en-IN"/>
         </w:rPr>
-        <w:t>• HTTP/HTTPS (</w:t>
-      </w:r>
-      <w:proofErr w:type="spellStart"/>
-      <w:r>
-        <w:rPr>
-          <w:b/>
-          <w:bCs/>
-          <w:sz w:val="24"/>
-          <w:szCs w:val="24"/>
-          <w:lang w:val="en-IN"/>
-        </w:rPr>
-        <w:t>HyperText</w:t>
-      </w:r>
-      <w:proofErr w:type="spellEnd"/>
-      <w:r>
-        <w:rPr>
-          <w:b/>
-          <w:bCs/>
-          <w:sz w:val="24"/>
-          <w:szCs w:val="24"/>
-          <w:lang w:val="en-IN"/>
-        </w:rPr>
-        <w:t xml:space="preserve"> Transfer Protocol / Secure):</w:t>
+        <w:t>• HTTP/HTTPS (HyperText Transfer Protocol / Secure):</w:t>
       </w:r>
     </w:p>
     <w:p>
@@ -9455,25 +9433,7 @@
           <w:szCs w:val="24"/>
           <w:lang w:val="en-IN"/>
         </w:rPr>
-        <w:t xml:space="preserve">A type of </w:t>
-      </w:r>
-      <w:proofErr w:type="spellStart"/>
-      <w:r>
-        <w:rPr>
-          <w:sz w:val="24"/>
-          <w:szCs w:val="24"/>
-          <w:lang w:val="en-IN"/>
-        </w:rPr>
-        <w:t>cyber attack</w:t>
-      </w:r>
-      <w:proofErr w:type="spellEnd"/>
-      <w:r>
-        <w:rPr>
-          <w:sz w:val="24"/>
-          <w:szCs w:val="24"/>
-          <w:lang w:val="en-IN"/>
-        </w:rPr>
-        <w:t xml:space="preserve"> where malicious SQL queries are inserted into input fields. It is prevented using prepared statements and input validation.</w:t>
+        <w:t>A type of cyber attack where malicious SQL queries are inserted into input fields. It is prevented using prepared statements and input validation.</w:t>
       </w:r>
     </w:p>
     <w:p>
@@ -10070,19 +10030,8 @@
           <w:sz w:val="24"/>
           <w:szCs w:val="24"/>
         </w:rPr>
-        <w:t xml:space="preserve">c) </w:t>
-      </w:r>
-      <w:proofErr w:type="spellStart"/>
-      <w:r>
-        <w:rPr>
-          <w:b/>
-          <w:bCs/>
-          <w:sz w:val="24"/>
-          <w:szCs w:val="24"/>
-        </w:rPr>
-        <w:t>GeeksforGeeks</w:t>
-      </w:r>
-      <w:proofErr w:type="spellEnd"/>
+        <w:t>c) GeeksforGeeks</w:t>
+      </w:r>
     </w:p>
     <w:p>
       <w:pPr>
@@ -10143,21 +10092,12 @@
           <w:szCs w:val="24"/>
         </w:rPr>
       </w:pPr>
-      <w:proofErr w:type="spellStart"/>
-      <w:r>
-        <w:rPr>
-          <w:sz w:val="24"/>
-          <w:szCs w:val="24"/>
-        </w:rPr>
-        <w:t>GeeksforGeeks</w:t>
-      </w:r>
-      <w:proofErr w:type="spellEnd"/>
-      <w:r>
-        <w:rPr>
-          <w:sz w:val="24"/>
-          <w:szCs w:val="24"/>
-        </w:rPr>
-        <w:t xml:space="preserve"> was used as a supportive learning platform for understanding both fundamental and advanced web development concepts. </w:t>
+      <w:r>
+        <w:rPr>
+          <w:sz w:val="24"/>
+          <w:szCs w:val="24"/>
+        </w:rPr>
+        <w:t xml:space="preserve">GeeksforGeeks was used as a supportive learning platform for understanding both fundamental and advanced web development concepts. </w:t>
       </w:r>
     </w:p>
     <w:p>
@@ -10750,27 +10690,7 @@
           <w:sz w:val="24"/>
           <w:szCs w:val="24"/>
         </w:rPr>
-        <w:t xml:space="preserve">j) Browser Developer Tools (Chrome </w:t>
-      </w:r>
-      <w:proofErr w:type="spellStart"/>
-      <w:r>
-        <w:rPr>
-          <w:b/>
-          <w:bCs/>
-          <w:sz w:val="24"/>
-          <w:szCs w:val="24"/>
-        </w:rPr>
-        <w:t>DevTools</w:t>
-      </w:r>
-      <w:proofErr w:type="spellEnd"/>
-      <w:r>
-        <w:rPr>
-          <w:b/>
-          <w:bCs/>
-          <w:sz w:val="24"/>
-          <w:szCs w:val="24"/>
-        </w:rPr>
-        <w:t>)</w:t>
+        <w:t>j) Browser Developer Tools (Chrome DevTools)</w:t>
       </w:r>
     </w:p>
     <w:p>
@@ -12151,7 +12071,7 @@
           <w:lang w:val="en-IN"/>
         </w:rPr>
         <w:drawing>
-          <wp:anchor distT="0" distB="0" distL="114300" distR="114300" simplePos="0" relativeHeight="251636224" behindDoc="1" locked="0" layoutInCell="1" allowOverlap="1" wp14:anchorId="51374868" wp14:editId="6A7E1590">
+          <wp:anchor distT="0" distB="0" distL="114300" distR="114300" simplePos="0" relativeHeight="251636224" behindDoc="1" locked="0" layoutInCell="1" allowOverlap="1" wp14:anchorId="51374868" wp14:editId="103C72B8">
             <wp:simplePos x="0" y="0"/>
             <wp:positionH relativeFrom="column">
               <wp:posOffset>80010</wp:posOffset>
@@ -12289,7 +12209,7 @@
           <w:lang w:val="en-IN"/>
         </w:rPr>
         <w:drawing>
-          <wp:anchor distT="0" distB="0" distL="114300" distR="114300" simplePos="0" relativeHeight="251629056" behindDoc="1" locked="0" layoutInCell="1" allowOverlap="1" wp14:anchorId="04CCE995" wp14:editId="320E5275">
+          <wp:anchor distT="0" distB="0" distL="114300" distR="114300" simplePos="0" relativeHeight="251629056" behindDoc="1" locked="0" layoutInCell="1" allowOverlap="1" wp14:anchorId="04CCE995" wp14:editId="2F31454D">
             <wp:simplePos x="0" y="0"/>
             <wp:positionH relativeFrom="column">
               <wp:posOffset>4457488</wp:posOffset>
@@ -12560,21 +12480,12 @@
         </w:rPr>
       </w:pPr>
       <w:bookmarkStart w:id="20" w:name="_Hlk228286586"/>
-      <w:proofErr w:type="spellStart"/>
-      <w:r>
-        <w:rPr>
-          <w:rFonts w:asciiTheme="minorHAnsi" w:hAnsiTheme="minorHAnsi" w:cstheme="minorHAnsi"/>
-          <w:lang w:val="en-IN"/>
-        </w:rPr>
-        <w:t>user_id</w:t>
-      </w:r>
-      <w:proofErr w:type="spellEnd"/>
-      <w:r>
-        <w:rPr>
-          <w:rFonts w:asciiTheme="minorHAnsi" w:hAnsiTheme="minorHAnsi" w:cstheme="minorHAnsi"/>
-          <w:lang w:val="en-IN"/>
-        </w:rPr>
-        <w:t xml:space="preserve">: Unique identifier for each user </w:t>
+      <w:r>
+        <w:rPr>
+          <w:rFonts w:asciiTheme="minorHAnsi" w:hAnsiTheme="minorHAnsi" w:cstheme="minorHAnsi"/>
+          <w:lang w:val="en-IN"/>
+        </w:rPr>
+        <w:t xml:space="preserve">user_id: Unique identifier for each user </w:t>
       </w:r>
     </w:p>
     <w:p>
@@ -12591,7 +12502,6 @@
           <w:lang w:val="en-IN"/>
         </w:rPr>
       </w:pPr>
-      <w:proofErr w:type="spellStart"/>
       <w:r>
         <w:rPr>
           <w:rFonts w:asciiTheme="minorHAnsi" w:hAnsiTheme="minorHAnsi" w:cstheme="minorHAnsi"/>
@@ -12604,15 +12514,7 @@
           <w:rFonts w:asciiTheme="minorHAnsi" w:hAnsiTheme="minorHAnsi" w:cstheme="minorHAnsi"/>
           <w:lang w:val="en-IN"/>
         </w:rPr>
-        <w:t>name</w:t>
-      </w:r>
-      <w:proofErr w:type="spellEnd"/>
-      <w:r>
-        <w:rPr>
-          <w:rFonts w:asciiTheme="minorHAnsi" w:hAnsiTheme="minorHAnsi" w:cstheme="minorHAnsi"/>
-          <w:lang w:val="en-IN"/>
-        </w:rPr>
-        <w:t xml:space="preserve">: Stores the full name of the user </w:t>
+        <w:t xml:space="preserve">name: Stores the full name of the user </w:t>
       </w:r>
     </w:p>
     <w:p>
@@ -12674,21 +12576,12 @@
           <w:lang w:val="en-IN"/>
         </w:rPr>
       </w:pPr>
-      <w:proofErr w:type="spellStart"/>
-      <w:r>
-        <w:rPr>
-          <w:rFonts w:asciiTheme="minorHAnsi" w:hAnsiTheme="minorHAnsi" w:cstheme="minorHAnsi"/>
-          <w:lang w:val="en-IN"/>
-        </w:rPr>
-        <w:t>verification_code</w:t>
-      </w:r>
-      <w:proofErr w:type="spellEnd"/>
-      <w:r>
-        <w:rPr>
-          <w:rFonts w:asciiTheme="minorHAnsi" w:hAnsiTheme="minorHAnsi" w:cstheme="minorHAnsi"/>
-          <w:lang w:val="en-IN"/>
-        </w:rPr>
-        <w:t xml:space="preserve">: Used for email verification </w:t>
+      <w:r>
+        <w:rPr>
+          <w:rFonts w:asciiTheme="minorHAnsi" w:hAnsiTheme="minorHAnsi" w:cstheme="minorHAnsi"/>
+          <w:lang w:val="en-IN"/>
+        </w:rPr>
+        <w:t xml:space="preserve">verification_code: Used for email verification </w:t>
       </w:r>
     </w:p>
     <w:p>
@@ -12705,7 +12598,6 @@
           <w:lang w:val="en-IN"/>
         </w:rPr>
       </w:pPr>
-      <w:proofErr w:type="spellStart"/>
       <w:r>
         <w:rPr>
           <w:rFonts w:asciiTheme="minorHAnsi" w:hAnsiTheme="minorHAnsi" w:cstheme="minorHAnsi"/>
@@ -12720,7 +12612,6 @@
         </w:rPr>
         <w:t>_status</w:t>
       </w:r>
-      <w:proofErr w:type="spellEnd"/>
       <w:r>
         <w:rPr>
           <w:rFonts w:asciiTheme="minorHAnsi" w:hAnsiTheme="minorHAnsi" w:cstheme="minorHAnsi"/>
@@ -12744,7 +12635,7 @@
           <w:noProof/>
         </w:rPr>
         <w:drawing>
-          <wp:anchor distT="0" distB="0" distL="114300" distR="114300" simplePos="0" relativeHeight="251607552" behindDoc="1" locked="0" layoutInCell="1" allowOverlap="1" wp14:anchorId="3F2C8743" wp14:editId="0EF86DAA">
+          <wp:anchor distT="0" distB="0" distL="114300" distR="114300" simplePos="0" relativeHeight="251607552" behindDoc="1" locked="0" layoutInCell="1" allowOverlap="1" wp14:anchorId="3F2C8743" wp14:editId="0C9AF18C">
             <wp:simplePos x="0" y="0"/>
             <wp:positionH relativeFrom="column">
               <wp:posOffset>19050</wp:posOffset>
@@ -12873,21 +12764,12 @@
           <w:lang w:val="en-IN"/>
         </w:rPr>
       </w:pPr>
-      <w:proofErr w:type="spellStart"/>
-      <w:r>
-        <w:rPr>
-          <w:rFonts w:asciiTheme="minorHAnsi" w:hAnsiTheme="minorHAnsi" w:cstheme="minorHAnsi"/>
-          <w:lang w:val="en-IN"/>
-        </w:rPr>
-        <w:t>post_id</w:t>
-      </w:r>
-      <w:proofErr w:type="spellEnd"/>
-      <w:r>
-        <w:rPr>
-          <w:rFonts w:asciiTheme="minorHAnsi" w:hAnsiTheme="minorHAnsi" w:cstheme="minorHAnsi"/>
-          <w:lang w:val="en-IN"/>
-        </w:rPr>
-        <w:t xml:space="preserve">: Unique identifier for each blog post </w:t>
+      <w:r>
+        <w:rPr>
+          <w:rFonts w:asciiTheme="minorHAnsi" w:hAnsiTheme="minorHAnsi" w:cstheme="minorHAnsi"/>
+          <w:lang w:val="en-IN"/>
+        </w:rPr>
+        <w:t xml:space="preserve">post_id: Unique identifier for each blog post </w:t>
       </w:r>
     </w:p>
     <w:p>
@@ -12903,21 +12785,12 @@
           <w:lang w:val="en-IN"/>
         </w:rPr>
       </w:pPr>
-      <w:proofErr w:type="spellStart"/>
-      <w:r>
-        <w:rPr>
-          <w:rFonts w:asciiTheme="minorHAnsi" w:hAnsiTheme="minorHAnsi" w:cstheme="minorHAnsi"/>
-          <w:lang w:val="en-IN"/>
-        </w:rPr>
-        <w:t>user_id</w:t>
-      </w:r>
-      <w:proofErr w:type="spellEnd"/>
-      <w:r>
-        <w:rPr>
-          <w:rFonts w:asciiTheme="minorHAnsi" w:hAnsiTheme="minorHAnsi" w:cstheme="minorHAnsi"/>
-          <w:lang w:val="en-IN"/>
-        </w:rPr>
-        <w:t xml:space="preserve">: Foreign key linking the post to a user </w:t>
+      <w:r>
+        <w:rPr>
+          <w:rFonts w:asciiTheme="minorHAnsi" w:hAnsiTheme="minorHAnsi" w:cstheme="minorHAnsi"/>
+          <w:lang w:val="en-IN"/>
+        </w:rPr>
+        <w:t xml:space="preserve">user_id: Foreign key linking the post to a user </w:t>
       </w:r>
     </w:p>
     <w:p>
@@ -13410,7 +13283,6 @@
           <w:lang w:val="en-IN"/>
         </w:rPr>
       </w:pPr>
-      <w:proofErr w:type="spellStart"/>
       <w:r>
         <w:rPr>
           <w:rFonts w:asciiTheme="minorHAnsi" w:hAnsiTheme="minorHAnsi" w:cstheme="minorHAnsi"/>
@@ -13418,7 +13290,6 @@
         </w:rPr>
         <w:t>blog_id</w:t>
       </w:r>
-      <w:proofErr w:type="spellEnd"/>
       <w:r>
         <w:rPr>
           <w:rFonts w:asciiTheme="minorHAnsi" w:hAnsiTheme="minorHAnsi" w:cstheme="minorHAnsi"/>
@@ -13448,7 +13319,6 @@
           <w:lang w:val="en-IN"/>
         </w:rPr>
       </w:pPr>
-      <w:proofErr w:type="spellStart"/>
       <w:r>
         <w:rPr>
           <w:rFonts w:asciiTheme="minorHAnsi" w:hAnsiTheme="minorHAnsi" w:cstheme="minorHAnsi"/>
@@ -13456,7 +13326,6 @@
         </w:rPr>
         <w:t>user_id</w:t>
       </w:r>
-      <w:proofErr w:type="spellEnd"/>
       <w:r>
         <w:rPr>
           <w:rFonts w:asciiTheme="minorHAnsi" w:hAnsiTheme="minorHAnsi" w:cstheme="minorHAnsi"/>
@@ -14147,12 +14016,33 @@
     </w:p>
     <w:p>
       <w:pPr>
-        <w:ind w:left="720"/>
-        <w:rPr>
-          <w:rFonts w:asciiTheme="minorHAnsi" w:hAnsiTheme="minorHAnsi" w:cstheme="minorHAnsi"/>
-          <w:lang w:val="en-IN"/>
-        </w:rPr>
-      </w:pPr>
+        <w:rPr>
+          <w:rFonts w:asciiTheme="minorHAnsi" w:hAnsiTheme="minorHAnsi" w:cstheme="minorHAnsi"/>
+          <w:lang w:val="en-IN"/>
+        </w:rPr>
+      </w:pPr>
+      <w:r>
+        <w:rPr>
+          <w:rFonts w:asciiTheme="minorHAnsi" w:hAnsiTheme="minorHAnsi" w:cstheme="minorHAnsi"/>
+          <w:lang w:val="en-IN"/>
+        </w:rPr>
+        <w:t>The Register Page is designed to allow new users to create an account on the BlogScript platform securely and easily. It provides a clean and user-friendly interface where users can enter their basic details such as username, email address, and password to complete the registration process.</w:t>
+      </w:r>
+    </w:p>
+    <w:p>
+      <w:pPr>
+        <w:rPr>
+          <w:rFonts w:asciiTheme="minorHAnsi" w:hAnsiTheme="minorHAnsi" w:cstheme="minorHAnsi"/>
+          <w:lang w:val="en-IN"/>
+        </w:rPr>
+      </w:pPr>
+      <w:r>
+        <w:rPr>
+          <w:rFonts w:asciiTheme="minorHAnsi" w:hAnsiTheme="minorHAnsi" w:cstheme="minorHAnsi"/>
+          <w:lang w:val="en-IN"/>
+        </w:rPr>
+        <w:t>The page includes proper input validation to ensure that users provide accurate and valid information before submission. Password fields are protected and securely processed using hashing techniques to enhance security. After successful registration, users may receive an email verification link to confirm their account authenticity.</w:t>
+      </w:r>
     </w:p>
     <w:p>
       <w:pPr>
@@ -14168,9 +14058,9 @@
           <w:lang w:val="en-IN"/>
         </w:rPr>
         <w:drawing>
-          <wp:inline distT="0" distB="0" distL="0" distR="0" wp14:anchorId="29330A44" wp14:editId="34A7C69A">
-            <wp:extent cx="5943600" cy="2756535"/>
-            <wp:effectExtent l="19050" t="19050" r="19050" b="24765"/>
+          <wp:inline distT="0" distB="0" distL="0" distR="0" wp14:anchorId="29330A44" wp14:editId="6ACB992B">
+            <wp:extent cx="5369379" cy="2490221"/>
+            <wp:effectExtent l="19050" t="19050" r="22225" b="24765"/>
             <wp:docPr id="236396175" name="Picture 1"/>
             <wp:cNvGraphicFramePr>
               <a:graphicFrameLocks xmlns:a="http://schemas.openxmlformats.org/drawingml/2006/main" noChangeAspect="1"/>
@@ -14191,7 +14081,7 @@
                   <pic:spPr>
                     <a:xfrm>
                       <a:off x="0" y="0"/>
-                      <a:ext cx="5943600" cy="2756535"/>
+                      <a:ext cx="5396012" cy="2502573"/>
                     </a:xfrm>
                     <a:prstGeom prst="rect">
                       <a:avLst/>
@@ -14227,8 +14117,31 @@
       <w:pPr>
         <w:rPr>
           <w:rFonts w:asciiTheme="minorHAnsi" w:hAnsiTheme="minorHAnsi" w:cstheme="minorHAnsi"/>
-        </w:rPr>
-      </w:pPr>
+          <w:lang w:val="en-IN"/>
+        </w:rPr>
+      </w:pPr>
+      <w:r>
+        <w:rPr>
+          <w:rFonts w:asciiTheme="minorHAnsi" w:hAnsiTheme="minorHAnsi" w:cstheme="minorHAnsi"/>
+          <w:lang w:val="en-IN"/>
+        </w:rPr>
+        <w:t>The homepage displays blog posts in an organized manner, including important details such as the blog title, short description or preview content, author information, and publishing date. Users can quickly navigate through available blogs and select posts to read in detail.</w:t>
+      </w:r>
+    </w:p>
+    <w:p>
+      <w:pPr>
+        <w:rPr>
+          <w:rFonts w:asciiTheme="minorHAnsi" w:hAnsiTheme="minorHAnsi" w:cstheme="minorHAnsi"/>
+          <w:lang w:val="en-IN"/>
+        </w:rPr>
+      </w:pPr>
+      <w:r>
+        <w:rPr>
+          <w:rFonts w:asciiTheme="minorHAnsi" w:hAnsiTheme="minorHAnsi" w:cstheme="minorHAnsi"/>
+          <w:lang w:val="en-IN"/>
+        </w:rPr>
+        <w:t>The page also includes navigation options that allow users to access important sections of the application such as login, registration, dashboard, profile management, and blog creation. The responsive design ensures that the homepage adapts smoothly across different screen sizes including desktops, tablets, and mobile devices.</w:t>
+      </w:r>
     </w:p>
     <w:p>
       <w:pPr>
@@ -14289,20 +14202,12 @@
           <w:rFonts w:asciiTheme="minorHAnsi" w:hAnsiTheme="minorHAnsi" w:cstheme="minorHAnsi"/>
         </w:rPr>
       </w:pPr>
-    </w:p>
-    <w:p>
-      <w:pPr>
-        <w:rPr>
-          <w:rFonts w:asciiTheme="minorHAnsi" w:hAnsiTheme="minorHAnsi" w:cstheme="minorHAnsi"/>
-        </w:rPr>
-      </w:pPr>
-    </w:p>
-    <w:p>
-      <w:pPr>
-        <w:rPr>
-          <w:rFonts w:asciiTheme="minorHAnsi" w:hAnsiTheme="minorHAnsi" w:cstheme="minorHAnsi"/>
-        </w:rPr>
-      </w:pPr>
+      <w:r>
+        <w:rPr>
+          <w:rFonts w:asciiTheme="minorHAnsi" w:hAnsiTheme="minorHAnsi" w:cstheme="minorHAnsi"/>
+        </w:rPr>
+        <w:t>The Blog Section is one of the core components of the BlogScript web application, designed to display and manage all published blog posts in an organized and user-friendly manner. This section allows users to explore different blog articles, read detailed content, and interact with the platform efficiently.</w:t>
+      </w:r>
     </w:p>
     <w:p>
       <w:pPr>
@@ -14316,9 +14221,9 @@
           <w:noProof/>
         </w:rPr>
         <w:drawing>
-          <wp:inline distT="0" distB="0" distL="0" distR="0" wp14:anchorId="384CC9FF" wp14:editId="668D56EF">
-            <wp:extent cx="5943600" cy="3173730"/>
-            <wp:effectExtent l="19050" t="19050" r="19050" b="26670"/>
+          <wp:inline distT="0" distB="0" distL="0" distR="0" wp14:anchorId="384CC9FF" wp14:editId="7F7BAA9A">
+            <wp:extent cx="5944696" cy="3174317"/>
+            <wp:effectExtent l="19050" t="19050" r="18415" b="26670"/>
             <wp:docPr id="47300424" name="Picture 1"/>
             <wp:cNvGraphicFramePr>
               <a:graphicFrameLocks xmlns:a="http://schemas.openxmlformats.org/drawingml/2006/main" noChangeAspect="1"/>
@@ -14339,7 +14244,7 @@
                   <pic:spPr>
                     <a:xfrm>
                       <a:off x="0" y="0"/>
-                      <a:ext cx="5943600" cy="3173730"/>
+                      <a:ext cx="5968304" cy="3186923"/>
                     </a:xfrm>
                     <a:prstGeom prst="rect">
                       <a:avLst/>
@@ -14361,15 +14266,31 @@
       <w:pPr>
         <w:rPr>
           <w:rFonts w:asciiTheme="minorHAnsi" w:hAnsiTheme="minorHAnsi" w:cstheme="minorHAnsi"/>
-        </w:rPr>
-      </w:pPr>
-    </w:p>
-    <w:p>
-      <w:pPr>
-        <w:rPr>
-          <w:rFonts w:asciiTheme="minorHAnsi" w:hAnsiTheme="minorHAnsi" w:cstheme="minorHAnsi"/>
-        </w:rPr>
-      </w:pPr>
+          <w:lang w:val="en-IN"/>
+        </w:rPr>
+      </w:pPr>
+      <w:r>
+        <w:rPr>
+          <w:rFonts w:asciiTheme="minorHAnsi" w:hAnsiTheme="minorHAnsi" w:cstheme="minorHAnsi"/>
+          <w:lang w:val="en-IN"/>
+        </w:rPr>
+        <w:t>The User Admin Page is designed to provide administrative control over the BlogScript web application. This page allows the administrator to manage users, monitor blog activities, and maintain the overall functionality of the platform efficiently.</w:t>
+      </w:r>
+    </w:p>
+    <w:p>
+      <w:pPr>
+        <w:rPr>
+          <w:rFonts w:asciiTheme="minorHAnsi" w:hAnsiTheme="minorHAnsi" w:cstheme="minorHAnsi"/>
+          <w:lang w:val="en-IN"/>
+        </w:rPr>
+      </w:pPr>
+      <w:r>
+        <w:rPr>
+          <w:rFonts w:asciiTheme="minorHAnsi" w:hAnsiTheme="minorHAnsi" w:cstheme="minorHAnsi"/>
+          <w:lang w:val="en-IN"/>
+        </w:rPr>
+        <w:t>Through the admin dashboard, the administrator can view registered users, manage user-related information, and oversee blog posts published on the platform. The page provides organized access to important administrative functions such as editing or deleting inappropriate content, monitoring user activity, and maintaining platform security.</w:t>
+      </w:r>
     </w:p>
     <w:p>
       <w:pPr>
@@ -14383,9 +14304,9 @@
           <w:noProof/>
         </w:rPr>
         <w:drawing>
-          <wp:inline distT="0" distB="0" distL="0" distR="0" wp14:anchorId="552A5A6D" wp14:editId="48E46FDF">
-            <wp:extent cx="5943600" cy="2928620"/>
-            <wp:effectExtent l="19050" t="19050" r="19050" b="24130"/>
+          <wp:inline distT="0" distB="0" distL="0" distR="0" wp14:anchorId="552A5A6D" wp14:editId="3C11C545">
+            <wp:extent cx="5614544" cy="2766483"/>
+            <wp:effectExtent l="19050" t="19050" r="24765" b="15240"/>
             <wp:docPr id="1027460507" name="Picture 1"/>
             <wp:cNvGraphicFramePr>
               <a:graphicFrameLocks xmlns:a="http://schemas.openxmlformats.org/drawingml/2006/main" noChangeAspect="1"/>
@@ -14406,7 +14327,7 @@
                   <pic:spPr>
                     <a:xfrm>
                       <a:off x="0" y="0"/>
-                      <a:ext cx="5943600" cy="2928620"/>
+                      <a:ext cx="5625424" cy="2771844"/>
                     </a:xfrm>
                     <a:prstGeom prst="rect">
                       <a:avLst/>
@@ -14430,13 +14351,12 @@
           <w:rFonts w:asciiTheme="minorHAnsi" w:hAnsiTheme="minorHAnsi" w:cstheme="minorHAnsi"/>
         </w:rPr>
       </w:pPr>
-    </w:p>
-    <w:p>
-      <w:pPr>
-        <w:rPr>
-          <w:rFonts w:asciiTheme="minorHAnsi" w:hAnsiTheme="minorHAnsi" w:cstheme="minorHAnsi"/>
-        </w:rPr>
-      </w:pPr>
+      <w:r>
+        <w:rPr>
+          <w:rFonts w:asciiTheme="minorHAnsi" w:hAnsiTheme="minorHAnsi" w:cstheme="minorHAnsi"/>
+        </w:rPr>
+        <w:t>The Post Create Page is designed to allow authenticated users to create and publish new blog posts on the BlogScript platform. It provides a simple, organized, and user-friendly interface where users can easily enter blog-related information such as the post title, content, and other required details.</w:t>
+      </w:r>
     </w:p>
     <w:p>
       <w:pPr>
@@ -14450,9 +14370,9 @@
           <w:noProof/>
         </w:rPr>
         <w:drawing>
-          <wp:inline distT="0" distB="0" distL="0" distR="0" wp14:anchorId="0CEA5F65" wp14:editId="289878A3">
-            <wp:extent cx="5870480" cy="3211830"/>
-            <wp:effectExtent l="19050" t="19050" r="16510" b="26670"/>
+          <wp:inline distT="0" distB="0" distL="0" distR="0" wp14:anchorId="0CEA5F65" wp14:editId="5ED1F709">
+            <wp:extent cx="5653617" cy="3093180"/>
+            <wp:effectExtent l="19050" t="19050" r="23495" b="12065"/>
             <wp:docPr id="864993432" name="Picture 1"/>
             <wp:cNvGraphicFramePr>
               <a:graphicFrameLocks xmlns:a="http://schemas.openxmlformats.org/drawingml/2006/main" noChangeAspect="1"/>
@@ -14473,7 +14393,7 @@
                   <pic:spPr>
                     <a:xfrm>
                       <a:off x="0" y="0"/>
-                      <a:ext cx="5890670" cy="3222876"/>
+                      <a:ext cx="5677102" cy="3106029"/>
                     </a:xfrm>
                     <a:prstGeom prst="rect">
                       <a:avLst/>
@@ -14493,12 +14413,61 @@
     </w:p>
     <w:p>
       <w:pPr>
-        <w:ind w:firstLine="720"/>
-        <w:jc w:val="left"/>
-        <w:rPr>
-          <w:rFonts w:asciiTheme="minorHAnsi" w:hAnsiTheme="minorHAnsi" w:cstheme="minorHAnsi"/>
-        </w:rPr>
-      </w:pPr>
+        <w:tabs>
+          <w:tab w:val="left" w:pos="1455"/>
+        </w:tabs>
+        <w:rPr>
+          <w:rFonts w:asciiTheme="minorHAnsi" w:hAnsiTheme="minorHAnsi" w:cstheme="minorHAnsi"/>
+        </w:rPr>
+      </w:pPr>
+      <w:r>
+        <w:rPr>
+          <w:rFonts w:asciiTheme="minorHAnsi" w:hAnsiTheme="minorHAnsi" w:cstheme="minorHAnsi"/>
+        </w:rPr>
+        <w:tab/>
+      </w:r>
+    </w:p>
+    <w:p>
+      <w:pPr>
+        <w:tabs>
+          <w:tab w:val="left" w:pos="1455"/>
+        </w:tabs>
+        <w:rPr>
+          <w:rFonts w:asciiTheme="minorHAnsi" w:hAnsiTheme="minorHAnsi" w:cstheme="minorHAnsi"/>
+          <w:lang w:val="en-IN"/>
+        </w:rPr>
+      </w:pPr>
+      <w:r>
+        <w:rPr>
+          <w:rFonts w:asciiTheme="minorHAnsi" w:hAnsiTheme="minorHAnsi" w:cstheme="minorHAnsi"/>
+          <w:lang w:val="en-IN"/>
+        </w:rPr>
+        <w:t>The User Profile Update Page is designed to allow users to manage and update their personal account information within the BlogScript application. This page provides a secure and user-friendly interface where users can modify details such as username, email address, profile information, and password.</w:t>
+      </w:r>
+    </w:p>
+    <w:p>
+      <w:pPr>
+        <w:tabs>
+          <w:tab w:val="left" w:pos="1455"/>
+        </w:tabs>
+        <w:rPr>
+          <w:rFonts w:asciiTheme="minorHAnsi" w:hAnsiTheme="minorHAnsi" w:cstheme="minorHAnsi"/>
+          <w:lang w:val="en-IN"/>
+        </w:rPr>
+      </w:pPr>
+      <w:r>
+        <w:rPr>
+          <w:rFonts w:asciiTheme="minorHAnsi" w:hAnsiTheme="minorHAnsi" w:cstheme="minorHAnsi"/>
+          <w:lang w:val="en-IN"/>
+        </w:rPr>
+        <w:t xml:space="preserve">The page is integrated with the authentication system to ensure that only authorized users can access </w:t>
+      </w:r>
+      <w:r>
+        <w:rPr>
+          <w:rFonts w:asciiTheme="minorHAnsi" w:hAnsiTheme="minorHAnsi" w:cstheme="minorHAnsi"/>
+        </w:rPr>
+        <w:t>The Public Profile Page is designed to display publicly accessible information about a user within the BlogScript platform. This page allows visitors and readers to view basic profile details of a blog author along with the blogs published by that user.</w:t>
+      </w:r>
       <w:r>
         <w:rPr>
           <w:rFonts w:asciiTheme="minorHAnsi" w:hAnsiTheme="minorHAnsi" w:cstheme="minorHAnsi"/>
@@ -14576,29 +14545,6 @@
     </w:p>
     <w:p>
       <w:pPr>
-        <w:ind w:firstLine="720"/>
-        <w:jc w:val="left"/>
-        <w:rPr>
-          <w:rFonts w:asciiTheme="minorHAnsi" w:hAnsiTheme="minorHAnsi" w:cstheme="minorHAnsi"/>
-        </w:rPr>
-      </w:pPr>
-    </w:p>
-    <w:p>
-      <w:pPr>
-        <w:rPr>
-          <w:rFonts w:asciiTheme="minorHAnsi" w:hAnsiTheme="minorHAnsi" w:cstheme="minorHAnsi"/>
-        </w:rPr>
-      </w:pPr>
-    </w:p>
-    <w:p>
-      <w:pPr>
-        <w:rPr>
-          <w:rFonts w:asciiTheme="minorHAnsi" w:hAnsiTheme="minorHAnsi" w:cstheme="minorHAnsi"/>
-        </w:rPr>
-      </w:pPr>
-    </w:p>
-    <w:p>
-      <w:pPr>
         <w:rPr>
           <w:rFonts w:asciiTheme="minorHAnsi" w:hAnsiTheme="minorHAnsi" w:cstheme="minorHAnsi"/>
         </w:rPr>
@@ -14609,9 +14555,9 @@
           <w:noProof/>
         </w:rPr>
         <w:drawing>
-          <wp:inline distT="0" distB="0" distL="0" distR="0" wp14:anchorId="084B3948" wp14:editId="482E75FE">
-            <wp:extent cx="6008923" cy="2998470"/>
-            <wp:effectExtent l="19050" t="19050" r="11430" b="11430"/>
+          <wp:inline distT="0" distB="0" distL="0" distR="0" wp14:anchorId="084B3948" wp14:editId="68EAB160">
+            <wp:extent cx="6127268" cy="3057525"/>
+            <wp:effectExtent l="19050" t="19050" r="26035" b="9525"/>
             <wp:docPr id="325600184" name="Picture 1"/>
             <wp:cNvGraphicFramePr>
               <a:graphicFrameLocks xmlns:a="http://schemas.openxmlformats.org/drawingml/2006/main" noChangeAspect="1"/>
@@ -14632,7 +14578,7 @@
                   <pic:spPr>
                     <a:xfrm>
                       <a:off x="0" y="0"/>
-                      <a:ext cx="6010406" cy="2999210"/>
+                      <a:ext cx="6133455" cy="3060612"/>
                     </a:xfrm>
                     <a:prstGeom prst="rect">
                       <a:avLst/>
@@ -14663,6 +14609,81 @@
           <w:rFonts w:asciiTheme="minorHAnsi" w:hAnsiTheme="minorHAnsi" w:cstheme="minorHAnsi"/>
         </w:rPr>
       </w:pPr>
+    </w:p>
+    <w:p>
+      <w:pPr>
+        <w:rPr>
+          <w:rFonts w:asciiTheme="minorHAnsi" w:hAnsiTheme="minorHAnsi" w:cstheme="minorHAnsi"/>
+          <w:lang w:val="en-IN"/>
+        </w:rPr>
+      </w:pPr>
+      <w:r>
+        <w:rPr>
+          <w:rFonts w:asciiTheme="minorHAnsi" w:hAnsiTheme="minorHAnsi" w:cstheme="minorHAnsi"/>
+          <w:lang w:val="en-IN"/>
+        </w:rPr>
+        <w:t>The Blog Read Page is designed to display the complete content of a selected blog post in a clear, readable, and user-friendly format. It serves as the primary content viewing page of the BlogScript application, allowing users and visitors to read blog articles in detail.</w:t>
+      </w:r>
+    </w:p>
+    <w:p>
+      <w:pPr>
+        <w:rPr>
+          <w:rFonts w:asciiTheme="minorHAnsi" w:hAnsiTheme="minorHAnsi" w:cstheme="minorHAnsi"/>
+          <w:lang w:val="en-IN"/>
+        </w:rPr>
+      </w:pPr>
+      <w:r>
+        <w:rPr>
+          <w:rFonts w:asciiTheme="minorHAnsi" w:hAnsiTheme="minorHAnsi" w:cstheme="minorHAnsi"/>
+          <w:lang w:val="en-IN"/>
+        </w:rPr>
+        <w:t>This page typically displays important information related to the blog post, including the blog title, author name, publication date, featured image (if available), and the main blog content. The content is presented in a well-structured layout to improve readability and provide a distraction-free reading experience for users.</w:t>
+      </w:r>
+    </w:p>
+    <w:p>
+      <w:pPr>
+        <w:rPr>
+          <w:rFonts w:asciiTheme="minorHAnsi" w:hAnsiTheme="minorHAnsi" w:cstheme="minorHAnsi"/>
+          <w:lang w:val="en-IN"/>
+        </w:rPr>
+      </w:pPr>
+      <w:r>
+        <w:rPr>
+          <w:rFonts w:asciiTheme="minorHAnsi" w:hAnsiTheme="minorHAnsi" w:cstheme="minorHAnsi"/>
+          <w:lang w:val="en-IN"/>
+        </w:rPr>
+        <w:t>The Blog Read Page is dynamically connected with the backend database, where the requested blog post is retrieved based on its unique identifier. It ensures that the correct blog content is displayed whenever a user selects a specific post from the homepage or blog section.</w:t>
+      </w:r>
+    </w:p>
+    <w:p>
+      <w:pPr>
+        <w:rPr>
+          <w:rFonts w:asciiTheme="minorHAnsi" w:hAnsiTheme="minorHAnsi" w:cstheme="minorHAnsi"/>
+          <w:lang w:val="en-IN"/>
+        </w:rPr>
+      </w:pPr>
+      <w:r>
+        <w:rPr>
+          <w:rFonts w:asciiTheme="minorHAnsi" w:hAnsiTheme="minorHAnsi" w:cstheme="minorHAnsi"/>
+          <w:lang w:val="en-IN"/>
+        </w:rPr>
+        <w:t>Additional features such as like buttons, sharing options, related posts, and author profile links may also be integrated into this page to enhance user interaction and engagement. Proper validation and security measures are implemented to ensure safe content retrieval and display.</w:t>
+      </w:r>
+    </w:p>
+    <w:p>
+      <w:pPr>
+        <w:rPr>
+          <w:rFonts w:asciiTheme="minorHAnsi" w:hAnsiTheme="minorHAnsi" w:cstheme="minorHAnsi"/>
+          <w:lang w:val="en-IN"/>
+        </w:rPr>
+      </w:pPr>
+      <w:r>
+        <w:rPr>
+          <w:rFonts w:asciiTheme="minorHAnsi" w:hAnsiTheme="minorHAnsi" w:cstheme="minorHAnsi"/>
+          <w:lang w:val="en-IN"/>
+        </w:rPr>
+        <w:t>The page is fully responsive and optimized for different screen sizes, ensuring smooth accessibility across desktops, tablets, and mobile devices. Typography, spacing, and layout design are carefully maintained to provide an enhanced reading experience.</w:t>
+      </w:r>
     </w:p>
     <w:p>
       <w:pPr>
@@ -14839,13 +14860,110 @@
           <w:rFonts w:asciiTheme="minorHAnsi" w:hAnsiTheme="minorHAnsi" w:cstheme="minorHAnsi"/>
         </w:rPr>
       </w:pPr>
+    </w:p>
+    <w:p>
+      <w:pPr>
+        <w:rPr>
+          <w:rFonts w:asciiTheme="minorHAnsi" w:hAnsiTheme="minorHAnsi" w:cstheme="minorHAnsi"/>
+          <w:lang w:val="en-IN"/>
+        </w:rPr>
+      </w:pPr>
+      <w:r>
+        <w:rPr>
+          <w:rFonts w:asciiTheme="minorHAnsi" w:hAnsiTheme="minorHAnsi" w:cstheme="minorHAnsi"/>
+          <w:lang w:val="en-IN"/>
+        </w:rPr>
+        <w:t>The BlogScript Top Level Admin Dashboard is designed to provide complete administrative control and monitoring capabilities for the entire BlogScript web application. It acts as the central management panel where administrators can oversee platform activities, manage users, monitor blog content, and maintain system security efficiently.</w:t>
+      </w:r>
+    </w:p>
+    <w:p>
+      <w:pPr>
+        <w:rPr>
+          <w:rFonts w:asciiTheme="minorHAnsi" w:hAnsiTheme="minorHAnsi" w:cstheme="minorHAnsi"/>
+          <w:lang w:val="en-IN"/>
+        </w:rPr>
+      </w:pPr>
+      <w:r>
+        <w:rPr>
+          <w:rFonts w:asciiTheme="minorHAnsi" w:hAnsiTheme="minorHAnsi" w:cstheme="minorHAnsi"/>
+          <w:lang w:val="en-IN"/>
+        </w:rPr>
+        <w:t>The dashboard provides access to various administrative modules such as user management, blog post management, profile monitoring, likes management, and newsletter subscriber management. Through this interface, administrators can view system statistics, track platform activity, and perform actions such as editing or deleting inappropriate content when required.</w:t>
+      </w:r>
+    </w:p>
+    <w:p>
+      <w:pPr>
+        <w:rPr>
+          <w:rFonts w:asciiTheme="minorHAnsi" w:hAnsiTheme="minorHAnsi" w:cstheme="minorHAnsi"/>
+          <w:lang w:val="en-IN"/>
+        </w:rPr>
+      </w:pPr>
+      <w:r>
+        <w:rPr>
+          <w:rFonts w:asciiTheme="minorHAnsi" w:hAnsiTheme="minorHAnsi" w:cstheme="minorHAnsi"/>
+          <w:lang w:val="en-IN"/>
+        </w:rPr>
+        <w:t>The Top Level Admin Dashboard includes secure authentication and authorization mechanisms to ensure that only authorized administrators can access sensitive controls and management functionalities. Session validation and protected routes are implemented to maintain platform security and prevent unauthorized access.</w:t>
+      </w:r>
+    </w:p>
+    <w:p>
+      <w:pPr>
+        <w:rPr>
+          <w:rFonts w:asciiTheme="minorHAnsi" w:hAnsiTheme="minorHAnsi" w:cstheme="minorHAnsi"/>
+          <w:lang w:val="en-IN"/>
+        </w:rPr>
+      </w:pPr>
+      <w:r>
+        <w:rPr>
+          <w:rFonts w:asciiTheme="minorHAnsi" w:hAnsiTheme="minorHAnsi" w:cstheme="minorHAnsi"/>
+          <w:lang w:val="en-IN"/>
+        </w:rPr>
+        <w:t>The interface is designed with a structured and responsive layout that displays important information such as total users, total blog posts, recent activities, and system updates in an organized manner. Navigation panels, tables, and management sections are arranged clearly to simplify administrative operations and improve usability.</w:t>
+      </w:r>
+    </w:p>
+    <w:p>
+      <w:pPr>
+        <w:rPr>
+          <w:rFonts w:asciiTheme="minorHAnsi" w:hAnsiTheme="minorHAnsi" w:cstheme="minorHAnsi"/>
+          <w:lang w:val="en-IN"/>
+        </w:rPr>
+      </w:pPr>
+      <w:r>
+        <w:rPr>
+          <w:rFonts w:asciiTheme="minorHAnsi" w:hAnsiTheme="minorHAnsi" w:cstheme="minorHAnsi"/>
+          <w:lang w:val="en-IN"/>
+        </w:rPr>
+        <w:t>The dashboard also helps administrators maintain data integrity and platform performance by providing centralized access to backend operations. It supports efficient content moderation, user supervision, and overall system management within the BlogScript application.</w:t>
+      </w:r>
+    </w:p>
+    <w:p>
+      <w:pPr>
+        <w:rPr>
+          <w:rFonts w:asciiTheme="minorHAnsi" w:hAnsiTheme="minorHAnsi" w:cstheme="minorHAnsi"/>
+          <w:lang w:val="en-IN"/>
+        </w:rPr>
+      </w:pPr>
+      <w:r>
+        <w:rPr>
+          <w:rFonts w:asciiTheme="minorHAnsi" w:hAnsiTheme="minorHAnsi" w:cstheme="minorHAnsi"/>
+          <w:lang w:val="en-IN"/>
+        </w:rPr>
+        <w:t>Overall, the BlogScript Top Level Admin Dashboard serves as the core administrative component of the platform, ensuring smooth operation, better control, and effective management of all application resources and activities.</w:t>
+      </w:r>
+    </w:p>
+    <w:p>
+      <w:pPr>
+        <w:rPr>
+          <w:rFonts w:asciiTheme="minorHAnsi" w:hAnsiTheme="minorHAnsi" w:cstheme="minorHAnsi"/>
+        </w:rPr>
+      </w:pPr>
       <w:r>
         <w:rPr>
           <w:rFonts w:asciiTheme="minorHAnsi" w:hAnsiTheme="minorHAnsi" w:cstheme="minorHAnsi"/>
           <w:noProof/>
         </w:rPr>
         <w:drawing>
-          <wp:anchor distT="0" distB="0" distL="114300" distR="114300" simplePos="0" relativeHeight="251663872" behindDoc="0" locked="0" layoutInCell="1" allowOverlap="1" wp14:anchorId="6568F42A" wp14:editId="2FE77CD4">
+          <wp:anchor distT="0" distB="0" distL="114300" distR="114300" simplePos="0" relativeHeight="251663872" behindDoc="0" locked="0" layoutInCell="1" allowOverlap="1" wp14:anchorId="6568F42A" wp14:editId="464CD52D">
             <wp:simplePos x="0" y="0"/>
             <wp:positionH relativeFrom="column">
               <wp:posOffset>-57150</wp:posOffset>
@@ -14939,13 +15057,6 @@
       <w:pPr>
         <w:rPr>
           <w:rFonts w:asciiTheme="minorHAnsi" w:hAnsiTheme="minorHAnsi" w:cstheme="minorHAnsi"/>
-        </w:rPr>
-      </w:pPr>
-    </w:p>
-    <w:p>
-      <w:pPr>
-        <w:rPr>
-          <w:rFonts w:asciiTheme="minorHAnsi" w:hAnsiTheme="minorHAnsi" w:cstheme="minorHAnsi"/>
           <w:b/>
           <w:bCs/>
         </w:rPr>
@@ -14957,6 +15068,19 @@
           <w:bCs/>
         </w:rPr>
         <w:t xml:space="preserve">F. Project Repository </w:t>
+      </w:r>
+    </w:p>
+    <w:p>
+      <w:pPr>
+        <w:rPr>
+          <w:rFonts w:asciiTheme="minorHAnsi" w:hAnsiTheme="minorHAnsi" w:cstheme="minorHAnsi"/>
+        </w:rPr>
+      </w:pPr>
+      <w:r>
+        <w:rPr>
+          <w:rFonts w:asciiTheme="minorHAnsi" w:hAnsiTheme="minorHAnsi" w:cstheme="minorHAnsi"/>
+        </w:rPr>
+        <w:t>The GitHub Repository for the BlogScript project serves as the central platform for storing, managing, and maintaining the complete source code of the application. It provides version control functionality that helps track changes, manage updates, and maintain the overall development workflow of the project.</w:t>
       </w:r>
     </w:p>
     <w:p>
@@ -15025,20 +15149,6 @@
           <w:rFonts w:asciiTheme="minorHAnsi" w:hAnsiTheme="minorHAnsi" w:cstheme="minorHAnsi"/>
         </w:rPr>
       </w:pPr>
-    </w:p>
-    <w:p>
-      <w:pPr>
-        <w:rPr>
-          <w:rFonts w:asciiTheme="minorHAnsi" w:hAnsiTheme="minorHAnsi" w:cstheme="minorHAnsi"/>
-        </w:rPr>
-      </w:pPr>
-    </w:p>
-    <w:p>
-      <w:pPr>
-        <w:rPr>
-          <w:rFonts w:asciiTheme="minorHAnsi" w:hAnsiTheme="minorHAnsi" w:cstheme="minorHAnsi"/>
-        </w:rPr>
-      </w:pPr>
       <w:r>
         <w:rPr>
           <w:rFonts w:asciiTheme="minorHAnsi" w:hAnsiTheme="minorHAnsi" w:cstheme="minorHAnsi"/>
@@ -15249,31 +15359,7 @@
           <w:szCs w:val="24"/>
           <w:lang w:val="en-IN" w:eastAsia="en-IN" w:bidi="hi-IN"/>
         </w:rPr>
-        <w:t xml:space="preserve">College of Computing Science &amp; Information Technology, </w:t>
-      </w:r>
-      <w:proofErr w:type="spellStart"/>
-      <w:r>
-        <w:rPr>
-          <w:rFonts w:asciiTheme="minorHAnsi" w:eastAsia="Times New Roman" w:hAnsiTheme="minorHAnsi" w:cstheme="minorHAnsi"/>
-          <w:b/>
-          <w:bCs/>
-          <w:sz w:val="24"/>
-          <w:szCs w:val="24"/>
-          <w:lang w:val="en-IN" w:eastAsia="en-IN" w:bidi="hi-IN"/>
-        </w:rPr>
-        <w:t>Teerthanker</w:t>
-      </w:r>
-      <w:proofErr w:type="spellEnd"/>
-      <w:r>
-        <w:rPr>
-          <w:rFonts w:asciiTheme="minorHAnsi" w:eastAsia="Times New Roman" w:hAnsiTheme="minorHAnsi" w:cstheme="minorHAnsi"/>
-          <w:b/>
-          <w:bCs/>
-          <w:sz w:val="24"/>
-          <w:szCs w:val="24"/>
-          <w:lang w:val="en-IN" w:eastAsia="en-IN" w:bidi="hi-IN"/>
-        </w:rPr>
-        <w:t xml:space="preserve"> Mahaveer University, Moradabad</w:t>
+        <w:t>College of Computing Science &amp; Information Technology, Teerthanker Mahaveer University, Moradabad</w:t>
       </w:r>
       <w:r>
         <w:rPr>
@@ -21262,7 +21348,6 @@
   <w:style w:type="character" w:default="1" w:styleId="DefaultParagraphFont">
     <w:name w:val="Default Paragraph Font"/>
     <w:uiPriority w:val="1"/>
-    <w:semiHidden/>
     <w:unhideWhenUsed/>
   </w:style>
   <w:style w:type="table" w:default="1" w:styleId="TableNormal">

</xml_diff>